<commit_message>
Complete Scarlet portal audit and responsive polish
</commit_message>
<xml_diff>
--- a/docs/HALVETH_SCARLET_PORTAL_MEMORANDUM.docx
+++ b/docs/HALVETH_SCARLET_PORTAL_MEMORANDUM.docx
@@ -207,6 +207,8 @@
     </w:p>
     <w:p>
       <w:pPr>
+        <w:pStyle w:val="Heading1"/>
+        <w:spacing w:before="0" w:after="160"/>
         <w:jc w:val="center"/>
         <w:rPr>
           <w:rFonts w:ascii="Garamond" w:cs="Garamond" w:eastAsia="Garamond" w:hAnsi="Garamond"/>
@@ -217,6 +219,7 @@
       </w:pPr>
       <w:r>
         <w:rPr>
+          <w:color w:val="auto"/>
           <w:rFonts w:ascii="Garamond" w:hAnsi="Garamond" w:eastAsia="Garamond"/>
           <w:b/>
           <w:sz w:val="24"/>
@@ -633,7 +636,8 @@
     </w:p>
     <w:p>
       <w:pPr>
-        <w:spacing w:line="360" w:lineRule="auto"/>
+        <w:pStyle w:val="Heading1"/>
+        <w:spacing w:line="360" w:lineRule="auto" w:before="0" w:after="160"/>
         <w:jc w:val="center"/>
         <w:rPr>
           <w:rFonts w:ascii="Garamond" w:cs="Garamond" w:eastAsia="Garamond" w:hAnsi="Garamond"/>
@@ -644,6 +648,7 @@
       </w:pPr>
       <w:r>
         <w:rPr>
+          <w:color w:val="auto"/>
           <w:rFonts w:ascii="Garamond" w:hAnsi="Garamond" w:eastAsia="Garamond"/>
           <w:b/>
           <w:sz w:val="24"/>
@@ -765,7 +770,7 @@
           <w:sz w:val="24"/>
         </w:rPr>
         <w:tab/>
-        <w:t>Bewegung bleibt standardmäßig ruhig. Automatisch startende Bewegung über fünf Sekunden braucht nach WCAG 2.2.2 eine erreichbare Pause-, Stop- oder Ausblendmöglichkeit; die Systempräferenz `prefers-reduced-motion` wird respektiert [W1–W2]. Für normalen Text gilt ein Zielkontrast von mindestens 4,5:1, für große Schrift 3:1 [W3]. Fokus wird als gut sichtbare, nicht abgeschnittene Kontur gestaltet [W4]. Interaktive Ziele werden auf mindestens 44 × 44 CSS-Pixel ausgelegt und übertreffen damit die WCAG-Mindestgröße von 24 × 24 [W5]. Rote Lichtakzente blitzen nicht und bleiben unter den W3C-Grenzen [W6].</w:t>
+        <w:t>Bewegung bleibt standardmäßig ruhig. Automatisch startende Bewegung über fünf Sekunden braucht nach WCAG 2.2.2 eine erreichbare Pause-, Stop- oder Ausblendmöglichkeit; die Systempräferenz `prefers-reduced-motion` wird respektiert [W1–W2]. Für normalen Text gilt ein Zielkontrast von mindestens 4,5:1, für große Schrift 3:1 [W3]. Fokus wird als gut sichtbare, nicht abgeschnittene Kontur gestaltet [W4]. Zentrale Primärkontrollen wie Herz- und Q-Zugang sind mit Trefferflächen von 44 × 44 CSS-Pixeln oder größer gestaltet. Kleinere Sekundär- und Textziele werden gesondert nach dem WCAG-2.2-Erfolgskriterium 2.5.8 geprüft; daraus folgt keine pauschale Konformitätszusage [W5]. Rote Lichtakzente blitzen nicht und bleiben unter den W3C-Grenzen [W6].</w:t>
       </w:r>
     </w:p>
     <w:p>
@@ -782,7 +787,7 @@
           <w:rFonts w:ascii="Garamond" w:hAnsi="Garamond" w:eastAsia="Garamond"/>
           <w:sz w:val="24"/>
         </w:rPr>
-        <w:t>Die GitHub-Anzeige „claude“ ist als Herkunftsmetadatum zu lesen. In der dokumentierten Prüfung von `halveth-tresor` trugen 17 von 18 Commit-Nachrichten den Trailer `Co-Authored-By: Claude Opus 4.8 &lt;noreply@anthropic.com&gt;`; Autor und Committer der 18 Commits waren Juri-Halveth. In `halveth-scarlet` wurden 26 Commits und kein solcher Trailer festgestellt. GitHub beschreibt `Co-authored-by` als Trailer, der einen Commit mehreren Autoren zuordnet und bei passender Konto-E-Mail als Beitrag zählt [G1]. Die Contributor-Ansicht aggregiert Commit-Beiträge und kann nach Historienänderungen verzögert aktualisiert werden [G2]. Daraus folgt: Die Anzeige belegt vorhandene Zuordnungsmetadaten. Sie belegt keinen nachträglichen Selbsterkennungsakt, keine Führungsrolle und keinen bestimmten Anteil am Code. Weshalb die Anzeige erst jetzt auffiel oder erschien, bleibt UNKNOWN.</w:t>
+        <w:t>Die GitHub-Anzeige „claude“ ist als Herkunftsmetadatum zu lesen. In der dokumentierten Prüfung von `halveth-tresor` trugen 17 von 18 Commit-Nachrichten den Trailer `Co-Authored-By: Claude Opus 4.8 &lt;noreply@anthropic.com&gt;`; Autor und Committer der 18 Commits waren Juri-Halveth. Prüfstand 13.09.2026: In `halveth-scarlet` wurden 26 Commits und kein solcher Trailer festgestellt. GitHub beschreibt `Co-authored-by` als Trailer, der einen Commit mehreren Autoren zuordnet und bei passender Konto-E-Mail als Beitrag zählt [G1]. Die Contributor-Ansicht aggregiert Commit-Beiträge und kann nach Historienänderungen verzögert aktualisiert werden [G2]. Daraus folgt: Die Anzeige belegt vorhandene Zuordnungsmetadaten. Sie belegt keinen nachträglichen Selbsterkennungsakt, keine Führungsrolle und keinen bestimmten Anteil am Code. Weshalb die Anzeige erst jetzt auffiel oder erschien, bleibt UNKNOWN.</w:t>
       </w:r>
     </w:p>
     <w:p>
@@ -804,7 +809,8 @@
     </w:p>
     <w:p>
       <w:pPr>
-        <w:spacing w:line="360" w:lineRule="auto"/>
+        <w:pStyle w:val="Heading1"/>
+        <w:spacing w:line="360" w:lineRule="auto" w:before="0" w:after="160"/>
         <w:jc w:val="center"/>
         <w:rPr>
           <w:rFonts w:ascii="Garamond" w:cs="Garamond" w:eastAsia="Garamond" w:hAnsi="Garamond"/>
@@ -815,6 +821,7 @@
       </w:pPr>
       <w:r>
         <w:rPr>
+          <w:color w:val="auto"/>
           <w:rFonts w:ascii="Garamond" w:hAnsi="Garamond" w:eastAsia="Garamond"/>
           <w:b/>
           <w:sz w:val="24"/>
@@ -837,7 +844,7 @@
           <w:rFonts w:ascii="Garamond" w:hAnsi="Garamond" w:eastAsia="Garamond"/>
           <w:sz w:val="24"/>
         </w:rPr>
-        <w:t>Die acht Seiten sollten als ein Portal veröffentlicht werden, sobald der lokale Stand auf Desktop und Mobilgerät vollständig geprüft ist: gemeinsamer Shell-Code, vier fest gebundene Bildrollen, ruhige Bewegung, klare Fokusführung, 44-Pixel-Bedienziele, belastbarer Kontrast und erhaltene Originalinhalte. Vor dem Push werden Linkziele, Sprachparameter, Content-Security-Policy, Tastaturbedienung, Reduced-Motion-Verhalten und Bildladezeiten geprüft und im Diff dokumentiert. Juri-Halveth bleibt Entscheider für Commit, Push und Deployment. Eine Änderung der `halveth-tresor`-Historie bleibt ein eigener, ausdrücklich zu autorisierender Vorgang. Dieses Memorandum ist eine technische Design- und Provenienzdokumentation und keine Rechtsberatung.</w:t>
+        <w:t>Die acht Seiten sollten als ein Portal veröffentlicht werden, sobald der lokale Stand auf Desktop und Mobilgerät vollständig geprüft ist: gemeinsamer Shell-Code, vier fest gebundene Bildrollen, ruhige Bewegung, klare Fokusführung, zentrale Primärkontrollen ab 44 × 44 CSS-Pixeln sowie eine gesonderte WCAG-2.2-Prüfung kleinerer Sekundär- und Textziele, belastbarer Kontrast und erhaltene Originalinhalte. Vor dem Push werden Linkziele, Sprachparameter, Content-Security-Policy, Tastaturbedienung, Reduced-Motion-Verhalten und Bildladezeiten geprüft und im Diff dokumentiert. Juri-Halveth bleibt Entscheider für Commit, Push und Deployment. Eine Änderung der `halveth-tresor`-Historie bleibt ein eigener, ausdrücklich zu autorisierender Vorgang. Dieses Memorandum ist eine technische Design- und Provenienzdokumentation und keine Rechtsberatung.</w:t>
       </w:r>
     </w:p>
     <w:p>

</xml_diff>